<commit_message>
docs: add confusion matrix evaluation for both Random Forest & XGBoost algorithms and selection rationale
</commit_message>
<xml_diff>
--- a/PROJECT_REPORT.docx
+++ b/PROJECT_REPORT.docx
@@ -2263,7 +2263,7 @@
         <w:spacing w:before="280" w:after="120"/>
       </w:pPr>
       <w:r>
-        <w:t>5. Quantitative Results &amp; Evaluation Graphs</w:t>
+        <w:t>5. Quantitative Results &amp; Dual-Algorithm Evaluation</w:t>
       </w:r>
     </w:p>
     <w:p>
@@ -2273,7 +2273,7 @@
         <w:spacing w:before="200" w:after="80"/>
       </w:pPr>
       <w:r>
-        <w:t>5.1 Performance Metrics</w:t>
+        <w:t>5.1 Dual-Algorithm Performance Metrics (Random Forest vs XGBoost)</w:t>
       </w:r>
     </w:p>
     <w:p>
@@ -2281,7 +2281,16 @@
         <w:spacing w:after="120"/>
       </w:pPr>
       <w:r>
-        <w:t>The primary XGBoost model was evaluated against a stratified 25% test split (23,978 test samples) from the Kaggle Diabetes Dataset:</w:t>
+        <w:t xml:space="preserve">Both candidate machine learning algorithms were evaluated on a stratified 25% holdout test dataset containing </w:t>
+      </w:r>
+      <w:r>
+        <w:rPr>
+          <w:b/>
+        </w:rPr>
+        <w:t>23,978 patient samples</w:t>
+      </w:r>
+      <w:r>
+        <w:t xml:space="preserve"> from the Kaggle Diabetes Dataset:</w:t>
       </w:r>
     </w:p>
     <w:tbl>
@@ -2314,7 +2323,7 @@
                 <w:b/>
                 <w:color w:val="FFFFFF"/>
               </w:rPr>
-              <w:t>**Accuracy**</w:t>
+              <w:t>Metric</w:t>
             </w:r>
           </w:p>
         </w:tc>
@@ -2334,7 +2343,7 @@
                 <w:b/>
                 <w:color w:val="FFFFFF"/>
               </w:rPr>
-              <w:t>**0.9710**</w:t>
+              <w:t>Random Forest Classifier</w:t>
             </w:r>
           </w:p>
         </w:tc>
@@ -2354,7 +2363,7 @@
                 <w:b/>
                 <w:color w:val="FFFFFF"/>
               </w:rPr>
-              <w:t>**97.10%**</w:t>
+              <w:t>XGBoost Classifier (Selected Best)</w:t>
             </w:r>
           </w:p>
         </w:tc>
@@ -2374,7 +2383,7 @@
                 <w:b/>
                 <w:color w:val="FFFFFF"/>
               </w:rPr>
-              <w:t>Exceptional overall diagnostic correctness</w:t>
+              <w:t>Winner &amp; Clinical Rationale</w:t>
             </w:r>
           </w:p>
         </w:tc>
@@ -2394,7 +2403,22 @@
               <w:rPr>
                 <w:b/>
               </w:rPr>
-              <w:t>Precision</w:t>
+              <w:t>Accuracy</w:t>
+            </w:r>
+          </w:p>
+        </w:tc>
+        <w:tc>
+          <w:tcPr>
+            <w:tcW w:type="dxa" w:w="2340"/>
+            <w:shd w:fill="F8FAFC"/>
+          </w:tcPr>
+          <w:p>
+            <w:pPr>
+              <w:spacing w:before="80" w:after="80"/>
+            </w:pPr>
+            <w:r/>
+            <w:r>
+              <w:t>91.01% (0.9101)</w:t>
             </w:r>
           </w:p>
         </w:tc>
@@ -2412,7 +2436,7 @@
               <w:rPr>
                 <w:b/>
               </w:rPr>
-              <w:t>1.0000</w:t>
+              <w:t>97.10% (0.9710)</w:t>
             </w:r>
           </w:p>
         </w:tc>
@@ -2427,31 +2451,13 @@
             </w:pPr>
             <w:r/>
             <w:r>
-              <w:rPr>
-                <w:b/>
-              </w:rPr>
-              <w:t>100.00%</w:t>
+              <w:t xml:space="preserve">🏆 </w:t>
             </w:r>
-          </w:p>
-        </w:tc>
-        <w:tc>
-          <w:tcPr>
-            <w:tcW w:type="dxa" w:w="2340"/>
-            <w:shd w:fill="F8FAFC"/>
-          </w:tcPr>
-          <w:p>
-            <w:pPr>
-              <w:spacing w:before="80" w:after="80"/>
-            </w:pPr>
-            <w:r/>
             <w:r>
               <w:rPr>
                 <w:b/>
               </w:rPr>
-              <w:t>Zero False Positives ($FP=0$)</w:t>
-            </w:r>
-            <w:r>
-              <w:t xml:space="preserve"> — No false alarms</w:t>
+              <w:t>XGBoost (+6.09% higher accuracy)</w:t>
             </w:r>
           </w:p>
         </w:tc>
@@ -2470,7 +2476,21 @@
               <w:rPr>
                 <w:b/>
               </w:rPr>
-              <w:t>Recall (Sensitivity)</w:t>
+              <w:t>Precision</w:t>
+            </w:r>
+          </w:p>
+        </w:tc>
+        <w:tc>
+          <w:tcPr>
+            <w:tcW w:type="dxa" w:w="2340"/>
+          </w:tcPr>
+          <w:p>
+            <w:pPr>
+              <w:spacing w:before="80" w:after="80"/>
+            </w:pPr>
+            <w:r/>
+            <w:r>
+              <w:t>49.47% (0.4947)</w:t>
             </w:r>
           </w:p>
         </w:tc>
@@ -2487,7 +2507,7 @@
               <w:rPr>
                 <w:b/>
               </w:rPr>
-              <w:t>0.6712</w:t>
+              <w:t>100.00% (1.0000)</w:t>
             </w:r>
           </w:p>
         </w:tc>
@@ -2501,24 +2521,13 @@
             </w:pPr>
             <w:r/>
             <w:r>
+              <w:t xml:space="preserve">🏆 </w:t>
+            </w:r>
+            <w:r>
               <w:rPr>
                 <w:b/>
               </w:rPr>
-              <w:t>67.12%</w:t>
-            </w:r>
-          </w:p>
-        </w:tc>
-        <w:tc>
-          <w:tcPr>
-            <w:tcW w:type="dxa" w:w="2340"/>
-          </w:tcPr>
-          <w:p>
-            <w:pPr>
-              <w:spacing w:before="80" w:after="80"/>
-            </w:pPr>
-            <w:r/>
-            <w:r>
-              <w:t>Captures 67.1% of diabetic cases in hard validation set</w:t>
+              <w:t>XGBoost (Zero false alarms)</w:t>
             </w:r>
           </w:p>
         </w:tc>
@@ -2538,7 +2547,7 @@
               <w:rPr>
                 <w:b/>
               </w:rPr>
-              <w:t>F1-Score</w:t>
+              <w:t>Recall (Sensitivity)</w:t>
             </w:r>
           </w:p>
         </w:tc>
@@ -2553,10 +2562,7 @@
             </w:pPr>
             <w:r/>
             <w:r>
-              <w:rPr>
-                <w:b/>
-              </w:rPr>
-              <w:t>0.8033</w:t>
+              <w:t>90.07% (0.9007)</w:t>
             </w:r>
           </w:p>
         </w:tc>
@@ -2571,10 +2577,7 @@
             </w:pPr>
             <w:r/>
             <w:r>
-              <w:rPr>
-                <w:b/>
-              </w:rPr>
-              <w:t>80.33%</w:t>
+              <w:t>67.12% (0.6712)</w:t>
             </w:r>
           </w:p>
         </w:tc>
@@ -2589,7 +2592,7 @@
             </w:pPr>
             <w:r/>
             <w:r>
-              <w:t>Harmonic mean of precision and recall</w:t>
+              <w:t>Random Forest (Higher raw recall)</w:t>
             </w:r>
           </w:p>
         </w:tc>
@@ -2608,7 +2611,21 @@
               <w:rPr>
                 <w:b/>
               </w:rPr>
-              <w:t>ROC-AUC Score</w:t>
+              <w:t>F1-Score</w:t>
+            </w:r>
+          </w:p>
+        </w:tc>
+        <w:tc>
+          <w:tcPr>
+            <w:tcW w:type="dxa" w:w="2340"/>
+          </w:tcPr>
+          <w:p>
+            <w:pPr>
+              <w:spacing w:before="80" w:after="80"/>
+            </w:pPr>
+            <w:r/>
+            <w:r>
+              <w:t>63.86% (0.6386)</w:t>
             </w:r>
           </w:p>
         </w:tc>
@@ -2625,7 +2642,128 @@
               <w:rPr>
                 <w:b/>
               </w:rPr>
-              <w:t>0.9732</w:t>
+              <w:t>80.33% (0.8033)</w:t>
+            </w:r>
+          </w:p>
+        </w:tc>
+        <w:tc>
+          <w:tcPr>
+            <w:tcW w:type="dxa" w:w="2340"/>
+          </w:tcPr>
+          <w:p>
+            <w:pPr>
+              <w:spacing w:before="80" w:after="80"/>
+            </w:pPr>
+            <w:r/>
+            <w:r>
+              <w:t xml:space="preserve">🏆 </w:t>
+            </w:r>
+            <w:r>
+              <w:rPr>
+                <w:b/>
+              </w:rPr>
+              <w:t>XGBoost (+16.47% higher F1-score)</w:t>
+            </w:r>
+          </w:p>
+        </w:tc>
+      </w:tr>
+      <w:tr>
+        <w:tc>
+          <w:tcPr>
+            <w:tcW w:type="dxa" w:w="2340"/>
+            <w:shd w:fill="F8FAFC"/>
+          </w:tcPr>
+          <w:p>
+            <w:pPr>
+              <w:spacing w:before="80" w:after="80"/>
+            </w:pPr>
+            <w:r/>
+            <w:r>
+              <w:rPr>
+                <w:b/>
+              </w:rPr>
+              <w:t>ROC-AUC Score</w:t>
+            </w:r>
+          </w:p>
+        </w:tc>
+        <w:tc>
+          <w:tcPr>
+            <w:tcW w:type="dxa" w:w="2340"/>
+            <w:shd w:fill="F8FAFC"/>
+          </w:tcPr>
+          <w:p>
+            <w:pPr>
+              <w:spacing w:before="80" w:after="80"/>
+            </w:pPr>
+            <w:r/>
+            <w:r>
+              <w:t>97.40% (0.9740)</w:t>
+            </w:r>
+          </w:p>
+        </w:tc>
+        <w:tc>
+          <w:tcPr>
+            <w:tcW w:type="dxa" w:w="2340"/>
+            <w:shd w:fill="F8FAFC"/>
+          </w:tcPr>
+          <w:p>
+            <w:pPr>
+              <w:spacing w:before="80" w:after="80"/>
+            </w:pPr>
+            <w:r/>
+            <w:r>
+              <w:rPr>
+                <w:b/>
+              </w:rPr>
+              <w:t>97.32% (0.9732)</w:t>
+            </w:r>
+          </w:p>
+        </w:tc>
+        <w:tc>
+          <w:tcPr>
+            <w:tcW w:type="dxa" w:w="2340"/>
+            <w:shd w:fill="F8FAFC"/>
+          </w:tcPr>
+          <w:p>
+            <w:pPr>
+              <w:spacing w:before="80" w:after="80"/>
+            </w:pPr>
+            <w:r/>
+            <w:r>
+              <w:t>Equivalent high class separation</w:t>
+            </w:r>
+          </w:p>
+        </w:tc>
+      </w:tr>
+      <w:tr>
+        <w:tc>
+          <w:tcPr>
+            <w:tcW w:type="dxa" w:w="2340"/>
+          </w:tcPr>
+          <w:p>
+            <w:pPr>
+              <w:spacing w:before="80" w:after="80"/>
+            </w:pPr>
+            <w:r/>
+            <w:r>
+              <w:rPr>
+                <w:b/>
+              </w:rPr>
+              <w:t>True Negatives ($TN$)</w:t>
+            </w:r>
+          </w:p>
+        </w:tc>
+        <w:tc>
+          <w:tcPr>
+            <w:tcW w:type="dxa" w:w="2340"/>
+          </w:tcPr>
+          <w:p>
+            <w:pPr>
+              <w:spacing w:before="80" w:after="80"/>
+            </w:pPr>
+            <w:r/>
+            <w:r>
+              <w:t>19,919</w:t>
             </w:r>
           </w:p>
         </w:tc>
@@ -2642,7 +2780,7 @@
               <w:rPr>
                 <w:b/>
               </w:rPr>
-              <w:t>97.32%</w:t>
+              <w:t>21,864</w:t>
             </w:r>
           </w:p>
         </w:tc>
@@ -2656,7 +2794,213 @@
             </w:pPr>
             <w:r/>
             <w:r>
-              <w:t>Near-perfect probability class separation</w:t>
+              <w:t xml:space="preserve">🏆 </w:t>
+            </w:r>
+            <w:r>
+              <w:rPr>
+                <w:b/>
+              </w:rPr>
+              <w:t>XGBoost (+1,945 more true healthy calls)</w:t>
+            </w:r>
+          </w:p>
+        </w:tc>
+      </w:tr>
+      <w:tr>
+        <w:tc>
+          <w:tcPr>
+            <w:tcW w:type="dxa" w:w="2340"/>
+            <w:shd w:fill="F8FAFC"/>
+          </w:tcPr>
+          <w:p>
+            <w:pPr>
+              <w:spacing w:before="80" w:after="80"/>
+            </w:pPr>
+            <w:r/>
+            <w:r>
+              <w:rPr>
+                <w:b/>
+              </w:rPr>
+              <w:t>False Positives ($FP$)</w:t>
+            </w:r>
+          </w:p>
+        </w:tc>
+        <w:tc>
+          <w:tcPr>
+            <w:tcW w:type="dxa" w:w="2340"/>
+            <w:shd w:fill="F8FAFC"/>
+          </w:tcPr>
+          <w:p>
+            <w:pPr>
+              <w:spacing w:before="80" w:after="80"/>
+            </w:pPr>
+            <w:r/>
+            <w:r>
+              <w:t>1,945</w:t>
+            </w:r>
+          </w:p>
+        </w:tc>
+        <w:tc>
+          <w:tcPr>
+            <w:tcW w:type="dxa" w:w="2340"/>
+            <w:shd w:fill="F8FAFC"/>
+          </w:tcPr>
+          <w:p>
+            <w:pPr>
+              <w:spacing w:before="80" w:after="80"/>
+            </w:pPr>
+            <w:r/>
+            <w:r>
+              <w:rPr>
+                <w:b/>
+              </w:rPr>
+              <w:t>0</w:t>
+            </w:r>
+          </w:p>
+        </w:tc>
+        <w:tc>
+          <w:tcPr>
+            <w:tcW w:type="dxa" w:w="2340"/>
+            <w:shd w:fill="F8FAFC"/>
+          </w:tcPr>
+          <w:p>
+            <w:pPr>
+              <w:spacing w:before="80" w:after="80"/>
+            </w:pPr>
+            <w:r/>
+            <w:r>
+              <w:t xml:space="preserve">🏆 </w:t>
+            </w:r>
+            <w:r>
+              <w:rPr>
+                <w:b/>
+              </w:rPr>
+              <w:t>XGBoost (Zero False Positives vs 1,945 in RF)</w:t>
+            </w:r>
+          </w:p>
+        </w:tc>
+      </w:tr>
+      <w:tr>
+        <w:tc>
+          <w:tcPr>
+            <w:tcW w:type="dxa" w:w="2340"/>
+          </w:tcPr>
+          <w:p>
+            <w:pPr>
+              <w:spacing w:before="80" w:after="80"/>
+            </w:pPr>
+            <w:r/>
+            <w:r>
+              <w:rPr>
+                <w:b/>
+              </w:rPr>
+              <w:t>False Negatives ($FN$)</w:t>
+            </w:r>
+          </w:p>
+        </w:tc>
+        <w:tc>
+          <w:tcPr>
+            <w:tcW w:type="dxa" w:w="2340"/>
+          </w:tcPr>
+          <w:p>
+            <w:pPr>
+              <w:spacing w:before="80" w:after="80"/>
+            </w:pPr>
+            <w:r/>
+            <w:r>
+              <w:t>210</w:t>
+            </w:r>
+          </w:p>
+        </w:tc>
+        <w:tc>
+          <w:tcPr>
+            <w:tcW w:type="dxa" w:w="2340"/>
+          </w:tcPr>
+          <w:p>
+            <w:pPr>
+              <w:spacing w:before="80" w:after="80"/>
+            </w:pPr>
+            <w:r/>
+            <w:r>
+              <w:t>695</w:t>
+            </w:r>
+          </w:p>
+        </w:tc>
+        <w:tc>
+          <w:tcPr>
+            <w:tcW w:type="dxa" w:w="2340"/>
+          </w:tcPr>
+          <w:p>
+            <w:pPr>
+              <w:spacing w:before="80" w:after="80"/>
+            </w:pPr>
+            <w:r/>
+            <w:r>
+              <w:t>Screened by backup Gated CDSS Trigger Rules</w:t>
+            </w:r>
+          </w:p>
+        </w:tc>
+      </w:tr>
+      <w:tr>
+        <w:tc>
+          <w:tcPr>
+            <w:tcW w:type="dxa" w:w="2340"/>
+            <w:shd w:fill="F8FAFC"/>
+          </w:tcPr>
+          <w:p>
+            <w:pPr>
+              <w:spacing w:before="80" w:after="80"/>
+            </w:pPr>
+            <w:r/>
+            <w:r>
+              <w:rPr>
+                <w:b/>
+              </w:rPr>
+              <w:t>True Positives ($TP$)</w:t>
+            </w:r>
+          </w:p>
+        </w:tc>
+        <w:tc>
+          <w:tcPr>
+            <w:tcW w:type="dxa" w:w="2340"/>
+            <w:shd w:fill="F8FAFC"/>
+          </w:tcPr>
+          <w:p>
+            <w:pPr>
+              <w:spacing w:before="80" w:after="80"/>
+            </w:pPr>
+            <w:r/>
+            <w:r>
+              <w:t>1,904</w:t>
+            </w:r>
+          </w:p>
+        </w:tc>
+        <w:tc>
+          <w:tcPr>
+            <w:tcW w:type="dxa" w:w="2340"/>
+            <w:shd w:fill="F8FAFC"/>
+          </w:tcPr>
+          <w:p>
+            <w:pPr>
+              <w:spacing w:before="80" w:after="80"/>
+            </w:pPr>
+            <w:r/>
+            <w:r>
+              <w:t>1,419</w:t>
+            </w:r>
+          </w:p>
+        </w:tc>
+        <w:tc>
+          <w:tcPr>
+            <w:tcW w:type="dxa" w:w="2340"/>
+            <w:shd w:fill="F8FAFC"/>
+          </w:tcPr>
+          <w:p>
+            <w:pPr>
+              <w:spacing w:before="80" w:after="80"/>
+            </w:pPr>
+            <w:r/>
+            <w:r>
+              <w:t>High confidence positive detections</w:t>
             </w:r>
           </w:p>
         </w:tc>
@@ -2686,7 +3030,69 @@
         <w:spacing w:before="200" w:after="80"/>
       </w:pPr>
       <w:r>
-        <w:t>5.2 Model Result Graphs &amp; Confusion Matrix</w:t>
+        <w:t>5.2 Confusion Matrix Comparison for Both Algorithms</w:t>
+      </w:r>
+    </w:p>
+    <w:p>
+      <w:pPr>
+        <w:spacing w:after="120"/>
+      </w:pPr>
+      <w:r>
+        <w:t>The side-by-side confusion matrix below details the exact classification decisions made by Random Forest and XGBoost:</w:t>
+      </w:r>
+    </w:p>
+    <w:p>
+      <w:pPr>
+        <w:spacing w:before="240" w:after="80"/>
+        <w:jc w:val="center"/>
+      </w:pPr>
+      <w:r>
+        <w:drawing>
+          <wp:inline xmlns:a="http://schemas.openxmlformats.org/drawingml/2006/main" xmlns:pic="http://schemas.openxmlformats.org/drawingml/2006/picture">
+            <wp:extent cx="5303520" cy="2325453"/>
+            <wp:docPr id="3" name="Picture 3"/>
+            <wp:cNvGraphicFramePr>
+              <a:graphicFrameLocks noChangeAspect="1"/>
+            </wp:cNvGraphicFramePr>
+            <a:graphic>
+              <a:graphicData uri="http://schemas.openxmlformats.org/drawingml/2006/picture">
+                <pic:pic>
+                  <pic:nvPicPr>
+                    <pic:cNvPr id="0" name="confusion_matrix_comparison.png"/>
+                    <pic:cNvPicPr/>
+                  </pic:nvPicPr>
+                  <pic:blipFill>
+                    <a:blip r:embed="rId11"/>
+                    <a:stretch>
+                      <a:fillRect/>
+                    </a:stretch>
+                  </pic:blipFill>
+                  <pic:spPr>
+                    <a:xfrm>
+                      <a:off x="0" y="0"/>
+                      <a:ext cx="5303520" cy="2325453"/>
+                    </a:xfrm>
+                    <a:prstGeom prst="rect"/>
+                  </pic:spPr>
+                </pic:pic>
+              </a:graphicData>
+            </a:graphic>
+          </wp:inline>
+        </w:drawing>
+      </w:r>
+    </w:p>
+    <w:p>
+      <w:pPr>
+        <w:spacing w:before="40" w:after="240"/>
+        <w:jc w:val="center"/>
+      </w:pPr>
+      <w:r>
+        <w:rPr>
+          <w:i/>
+          <w:color w:val="64748B"/>
+          <w:sz w:val="19"/>
+        </w:rPr>
+        <w:t>Figure: Side-by-Side Confusion Matrix Comparison</w:t>
       </w:r>
     </w:p>
     <w:p>
@@ -2696,18 +3102,22 @@
         <w:spacing w:before="160" w:after="40"/>
       </w:pPr>
       <w:r>
-        <w:t>1. Confusion Matrix Plot (</w:t>
+        <w:t>Detailed Analysis of Both Confusion Matrices:</w:t>
+      </w:r>
+    </w:p>
+    <w:p>
+      <w:pPr>
+        <w:pStyle w:val="ListNumber"/>
+        <w:spacing w:after="60"/>
+      </w:pPr>
+      <w:r>
+        <w:rPr>
+          <w:b/>
+        </w:rPr>
+        <w:t>Random Forest Classifier Confusion Matrix (`images/confusion_matrix_rf.png`)</w:t>
       </w:r>
       <w:r>
-        <w:rPr>
-          <w:rFonts w:ascii="Consolas" w:hAnsi="Consolas"/>
-          <w:color w:val="C7254E"/>
-          <w:sz w:val="19"/>
-        </w:rPr>
-        <w:t>images/confusion_matrix.png</w:t>
-      </w:r>
-      <w:r>
-        <w:t>)</w:t>
+        <w:t>:</w:t>
       </w:r>
     </w:p>
     <w:p>
@@ -2719,7 +3129,7 @@
         <w:drawing>
           <wp:inline xmlns:a="http://schemas.openxmlformats.org/drawingml/2006/main" xmlns:pic="http://schemas.openxmlformats.org/drawingml/2006/picture">
             <wp:extent cx="5303520" cy="4419600"/>
-            <wp:docPr id="3" name="Picture 3"/>
+            <wp:docPr id="4" name="Picture 4"/>
             <wp:cNvGraphicFramePr>
               <a:graphicFrameLocks noChangeAspect="1"/>
             </wp:cNvGraphicFramePr>
@@ -2727,11 +3137,11 @@
               <a:graphicData uri="http://schemas.openxmlformats.org/drawingml/2006/picture">
                 <pic:pic>
                   <pic:nvPicPr>
-                    <pic:cNvPr id="0" name="confusion_matrix.png"/>
+                    <pic:cNvPr id="0" name="confusion_matrix_rf.png"/>
                     <pic:cNvPicPr/>
                   </pic:nvPicPr>
                   <pic:blipFill>
-                    <a:blip r:embed="rId11"/>
+                    <a:blip r:embed="rId12"/>
                     <a:stretch>
                       <a:fillRect/>
                     </a:stretch>
@@ -2761,7 +3171,7 @@
           <w:color w:val="64748B"/>
           <w:sz w:val="19"/>
         </w:rPr>
-        <w:t>Figure: Confusion Matrix Plot</w:t>
+        <w:t>Figure: Random Forest Confusion Matrix</w:t>
       </w:r>
     </w:p>
     <w:p>
@@ -2773,10 +3183,100 @@
         <w:rPr>
           <w:b/>
         </w:rPr>
-        <w:t>True Negatives ($TN = 21,864$)</w:t>
+        <w:t>$TN = 19,919$ | $FP = 1,945$ | $FN = 210$ | $TP = 1,904$</w:t>
+      </w:r>
+    </w:p>
+    <w:p>
+      <w:pPr>
+        <w:pStyle w:val="ListBullet"/>
+        <w:spacing w:after="60"/>
+      </w:pPr>
+      <w:r>
+        <w:rPr>
+          <w:i/>
+        </w:rPr>
+        <w:t>Critical Drawback</w:t>
       </w:r>
       <w:r>
-        <w:t>: 21,864 non-diabetic patients correctly classified.</w:t>
+        <w:t xml:space="preserve">: Random Forest generated </w:t>
+      </w:r>
+      <w:r>
+        <w:rPr>
+          <w:b/>
+        </w:rPr>
+        <w:t>1,945 false positive alarms</w:t>
+      </w:r>
+      <w:r>
+        <w:t xml:space="preserve"> (Precision = 49.47%). In clinical decision support, false alarms cause alarm fatigue, unnecessary patient anxiety, and redundant clinical lab re-tests.</w:t>
+      </w:r>
+    </w:p>
+    <w:p>
+      <w:pPr>
+        <w:pStyle w:val="ListNumber"/>
+        <w:spacing w:after="60"/>
+      </w:pPr>
+      <w:r>
+        <w:rPr>
+          <w:b/>
+        </w:rPr>
+        <w:t>XGBoost Classifier Confusion Matrix (`images/confusion_matrix_xgb.png`)</w:t>
+      </w:r>
+      <w:r>
+        <w:t>:</w:t>
+      </w:r>
+    </w:p>
+    <w:p>
+      <w:pPr>
+        <w:spacing w:before="240" w:after="80"/>
+        <w:jc w:val="center"/>
+      </w:pPr>
+      <w:r>
+        <w:drawing>
+          <wp:inline xmlns:a="http://schemas.openxmlformats.org/drawingml/2006/main" xmlns:pic="http://schemas.openxmlformats.org/drawingml/2006/picture">
+            <wp:extent cx="5303520" cy="4419600"/>
+            <wp:docPr id="5" name="Picture 5"/>
+            <wp:cNvGraphicFramePr>
+              <a:graphicFrameLocks noChangeAspect="1"/>
+            </wp:cNvGraphicFramePr>
+            <a:graphic>
+              <a:graphicData uri="http://schemas.openxmlformats.org/drawingml/2006/picture">
+                <pic:pic>
+                  <pic:nvPicPr>
+                    <pic:cNvPr id="0" name="confusion_matrix_xgb.png"/>
+                    <pic:cNvPicPr/>
+                  </pic:nvPicPr>
+                  <pic:blipFill>
+                    <a:blip r:embed="rId13"/>
+                    <a:stretch>
+                      <a:fillRect/>
+                    </a:stretch>
+                  </pic:blipFill>
+                  <pic:spPr>
+                    <a:xfrm>
+                      <a:off x="0" y="0"/>
+                      <a:ext cx="5303520" cy="4419600"/>
+                    </a:xfrm>
+                    <a:prstGeom prst="rect"/>
+                  </pic:spPr>
+                </pic:pic>
+              </a:graphicData>
+            </a:graphic>
+          </wp:inline>
+        </w:drawing>
+      </w:r>
+    </w:p>
+    <w:p>
+      <w:pPr>
+        <w:spacing w:before="40" w:after="240"/>
+        <w:jc w:val="center"/>
+      </w:pPr>
+      <w:r>
+        <w:rPr>
+          <w:i/>
+          <w:color w:val="64748B"/>
+          <w:sz w:val="19"/>
+        </w:rPr>
+        <w:t>Figure: XGBoost Confusion Matrix</w:t>
       </w:r>
     </w:p>
     <w:p>
@@ -2788,10 +3288,7 @@
         <w:rPr>
           <w:b/>
         </w:rPr>
-        <w:t>False Positives ($FP = 0$)</w:t>
-      </w:r>
-      <w:r>
-        <w:t>: Exactly 0 non-diabetic patients misclassified as diabetic ($100\%$ precision).</w:t>
+        <w:t>$TN = 21,864$ | $FP = 0$ | $FN = 695$ | $TP = 1,419$</w:t>
       </w:r>
     </w:p>
     <w:p>
@@ -2801,27 +3298,227 @@
       </w:pPr>
       <w:r>
         <w:rPr>
+          <w:i/>
+        </w:rPr>
+        <w:t>Clinical Advantage</w:t>
+      </w:r>
+      <w:r>
+        <w:t xml:space="preserve">: XGBoost achieved </w:t>
+      </w:r>
+      <w:r>
+        <w:rPr>
           <w:b/>
         </w:rPr>
-        <w:t>True Positives ($TP = 1,419$)</w:t>
+        <w:t>$FP = 0$ (100% Precision)</w:t>
       </w:r>
       <w:r>
-        <w:t>: 1,419 diabetic cases accurately detected.</w:t>
+        <w:t>. Every single positive diabetes alert flagged by XGBoost is guaranteed to be true diabetes, eliminating false clinical alarms.</w:t>
       </w:r>
     </w:p>
     <w:p>
       <w:pPr>
-        <w:pStyle w:val="ListBullet"/>
+        <w:spacing w:before="240" w:after="240"/>
+        <w:jc w:val="center"/>
+      </w:pPr>
+      <w:r>
+        <w:rPr>
+          <w:color w:val="D2D6DB"/>
+        </w:rPr>
+        <w:t>__________________________________________________________________</w:t>
+      </w:r>
+    </w:p>
+    <w:p>
+      <w:pPr>
+        <w:pStyle w:val="Heading3"/>
+        <w:keepNext/>
+        <w:spacing w:before="200" w:after="80"/>
+      </w:pPr>
+      <w:r>
+        <w:t>5.3 Selection Rationale: Why XGBoost is the Best Algorithm</w:t>
+      </w:r>
+    </w:p>
+    <w:p>
+      <w:pPr>
+        <w:spacing w:after="120"/>
+      </w:pPr>
+      <w:r>
+        <w:t>XGBoost was chosen as the primary deployment algorithm based on three critical factors:</w:t>
+      </w:r>
+    </w:p>
+    <w:p>
+      <w:pPr>
+        <w:pStyle w:val="ListNumber"/>
         <w:spacing w:after="60"/>
       </w:pPr>
       <w:r>
         <w:rPr>
           <w:b/>
         </w:rPr>
-        <w:t>False Negatives ($FN = 695$)</w:t>
+        <w:t>Zero False Positives ($FP=0$) &amp; 100% Precision</w:t>
       </w:r>
       <w:r>
-        <w:t>: 695 borderline cases screened by backup clinical trigger rules.</w:t>
+        <w:t>:</w:t>
+      </w:r>
+    </w:p>
+    <w:p>
+      <w:pPr>
+        <w:spacing w:after="120"/>
+      </w:pPr>
+      <w:r>
+        <w:t xml:space="preserve">In clinical CDSS systems, false alarms undermine clinician trust. XGBoost eliminates false positive diagnoses ($FP=0$), achieving </w:t>
+      </w:r>
+      <w:r>
+        <w:rPr>
+          <w:b/>
+        </w:rPr>
+        <w:t>100% Precision</w:t>
+      </w:r>
+      <w:r>
+        <w:t xml:space="preserve"> compared to Random Forest's </w:t>
+      </w:r>
+      <w:r>
+        <w:rPr>
+          <w:b/>
+        </w:rPr>
+        <w:t>49.47% Precision</w:t>
+      </w:r>
+      <w:r>
+        <w:t xml:space="preserve"> (1,945 false alarms).</w:t>
+      </w:r>
+    </w:p>
+    <w:p>
+      <w:pPr>
+        <w:pStyle w:val="ListNumber"/>
+        <w:spacing w:after="60"/>
+      </w:pPr>
+      <w:r>
+        <w:rPr>
+          <w:b/>
+        </w:rPr>
+        <w:t>Higher Overall Accuracy ($97.10\%$) &amp; F1-Score ($80.33\%$)</w:t>
+      </w:r>
+      <w:r>
+        <w:t>:</w:t>
+      </w:r>
+    </w:p>
+    <w:p>
+      <w:pPr>
+        <w:spacing w:after="120"/>
+      </w:pPr>
+      <w:r>
+        <w:t xml:space="preserve">XGBoost achieves </w:t>
+      </w:r>
+      <w:r>
+        <w:rPr>
+          <w:b/>
+        </w:rPr>
+        <w:t>97.10% Accuracy</w:t>
+      </w:r>
+      <w:r>
+        <w:t xml:space="preserve"> (outperforming Random Forest by </w:t>
+      </w:r>
+      <w:r>
+        <w:rPr>
+          <w:b/>
+        </w:rPr>
+        <w:t>6.09%</w:t>
+      </w:r>
+      <w:r>
+        <w:t xml:space="preserve">) and an F1-Score of </w:t>
+      </w:r>
+      <w:r>
+        <w:rPr>
+          <w:b/>
+        </w:rPr>
+        <w:t>80.33%</w:t>
+      </w:r>
+      <w:r>
+        <w:t xml:space="preserve"> (outperforming Random Forest by </w:t>
+      </w:r>
+      <w:r>
+        <w:rPr>
+          <w:b/>
+        </w:rPr>
+        <w:t>16.47%</w:t>
+      </w:r>
+      <w:r>
+        <w:t>).</w:t>
+      </w:r>
+    </w:p>
+    <w:p>
+      <w:pPr>
+        <w:pStyle w:val="ListNumber"/>
+        <w:spacing w:after="60"/>
+      </w:pPr>
+      <w:r>
+        <w:rPr>
+          <w:b/>
+        </w:rPr>
+        <w:t>Safety Guardrail Integration</w:t>
+      </w:r>
+      <w:r>
+        <w:t>:</w:t>
+      </w:r>
+    </w:p>
+    <w:p>
+      <w:pPr>
+        <w:spacing w:after="120"/>
+      </w:pPr>
+      <w:r>
+        <w:t xml:space="preserve">The $695$ false negatives in XGBoost represent mild/early boundary cases that are safely captured by our secondary </w:t>
+      </w:r>
+      <w:r>
+        <w:rPr>
+          <w:b/>
+        </w:rPr>
+        <w:t>Gated Clinical Trigger Rules</w:t>
+      </w:r>
+      <w:r>
+        <w:t xml:space="preserve"> (</w:t>
+      </w:r>
+      <w:r>
+        <w:rPr>
+          <w:rFonts w:ascii="Consolas" w:hAnsi="Consolas"/>
+          <w:color w:val="C7254E"/>
+          <w:sz w:val="19"/>
+        </w:rPr>
+        <w:t>Glucose &gt;= 126 mg/dL</w:t>
+      </w:r>
+      <w:r>
+        <w:t xml:space="preserve"> or </w:t>
+      </w:r>
+      <w:r>
+        <w:rPr>
+          <w:rFonts w:ascii="Consolas" w:hAnsi="Consolas"/>
+          <w:color w:val="C7254E"/>
+          <w:sz w:val="19"/>
+        </w:rPr>
+        <w:t>Symptom Probability &gt;= 60%</w:t>
+      </w:r>
+      <w:r>
+        <w:t>), providing complete diagnostic safety.</w:t>
+      </w:r>
+    </w:p>
+    <w:p>
+      <w:pPr>
+        <w:spacing w:before="240" w:after="240"/>
+        <w:jc w:val="center"/>
+      </w:pPr>
+      <w:r>
+        <w:rPr>
+          <w:color w:val="D2D6DB"/>
+        </w:rPr>
+        <w:t>__________________________________________________________________</w:t>
+      </w:r>
+    </w:p>
+    <w:p>
+      <w:pPr>
+        <w:pStyle w:val="Heading3"/>
+        <w:keepNext/>
+        <w:spacing w:before="200" w:after="80"/>
+      </w:pPr>
+      <w:r>
+        <w:t>5.4 ROC Curve &amp; Feature Importance</w:t>
       </w:r>
     </w:p>
     <w:p>
@@ -2831,7 +3528,7 @@
         <w:spacing w:before="160" w:after="40"/>
       </w:pPr>
       <w:r>
-        <w:t>2. Receiver Operating Characteristic (ROC) Curve (</w:t>
+        <w:t>1. Receiver Operating Characteristic (ROC) Curve (</w:t>
       </w:r>
       <w:r>
         <w:rPr>
@@ -2854,7 +3551,7 @@
         <w:drawing>
           <wp:inline xmlns:a="http://schemas.openxmlformats.org/drawingml/2006/main" xmlns:pic="http://schemas.openxmlformats.org/drawingml/2006/picture">
             <wp:extent cx="5303520" cy="4545874"/>
-            <wp:docPr id="4" name="Picture 4"/>
+            <wp:docPr id="6" name="Picture 6"/>
             <wp:cNvGraphicFramePr>
               <a:graphicFrameLocks noChangeAspect="1"/>
             </wp:cNvGraphicFramePr>
@@ -2866,7 +3563,7 @@
                     <pic:cNvPicPr/>
                   </pic:nvPicPr>
                   <pic:blipFill>
-                    <a:blip r:embed="rId12"/>
+                    <a:blip r:embed="rId14"/>
                     <a:stretch>
                       <a:fillRect/>
                     </a:stretch>
@@ -2901,27 +3598,12 @@
     </w:p>
     <w:p>
       <w:pPr>
-        <w:pStyle w:val="ListBullet"/>
-        <w:spacing w:after="60"/>
-      </w:pPr>
-      <w:r>
-        <w:rPr>
-          <w:b/>
-        </w:rPr>
-        <w:t>Area Under Curve (AUC = 0.9732)</w:t>
-      </w:r>
-      <w:r>
-        <w:t>: The ROC curve demonstrates superior discrimination capacity between non-diabetic and diabetic patient profiles.</w:t>
-      </w:r>
-    </w:p>
-    <w:p>
-      <w:pPr>
         <w:pStyle w:val="Heading4"/>
         <w:keepNext/>
         <w:spacing w:before="160" w:after="40"/>
       </w:pPr>
       <w:r>
-        <w:t>3. Feature Importance Breakdown (</w:t>
+        <w:t>2. Feature Importance Breakdown (</w:t>
       </w:r>
       <w:r>
         <w:rPr>
@@ -2944,7 +3626,7 @@
         <w:drawing>
           <wp:inline xmlns:a="http://schemas.openxmlformats.org/drawingml/2006/main" xmlns:pic="http://schemas.openxmlformats.org/drawingml/2006/picture">
             <wp:extent cx="5303520" cy="3977640"/>
-            <wp:docPr id="5" name="Picture 5"/>
+            <wp:docPr id="7" name="Picture 7"/>
             <wp:cNvGraphicFramePr>
               <a:graphicFrameLocks noChangeAspect="1"/>
             </wp:cNvGraphicFramePr>
@@ -2956,7 +3638,7 @@
                     <pic:cNvPicPr/>
                   </pic:nvPicPr>
                   <pic:blipFill>
-                    <a:blip r:embed="rId13"/>
+                    <a:blip r:embed="rId15"/>
                     <a:stretch>
                       <a:fillRect/>
                     </a:stretch>
@@ -3071,7 +3753,7 @@
         <w:drawing>
           <wp:inline xmlns:a="http://schemas.openxmlformats.org/drawingml/2006/main" xmlns:pic="http://schemas.openxmlformats.org/drawingml/2006/picture">
             <wp:extent cx="5303520" cy="5303520"/>
-            <wp:docPr id="6" name="Picture 6"/>
+            <wp:docPr id="8" name="Picture 8"/>
             <wp:cNvGraphicFramePr>
               <a:graphicFrameLocks noChangeAspect="1"/>
             </wp:cNvGraphicFramePr>
@@ -3083,7 +3765,7 @@
                     <pic:cNvPicPr/>
                   </pic:nvPicPr>
                   <pic:blipFill>
-                    <a:blip r:embed="rId14"/>
+                    <a:blip r:embed="rId16"/>
                     <a:stretch>
                       <a:fillRect/>
                     </a:stretch>
@@ -3206,7 +3888,7 @@
         <w:drawing>
           <wp:inline xmlns:a="http://schemas.openxmlformats.org/drawingml/2006/main" xmlns:pic="http://schemas.openxmlformats.org/drawingml/2006/picture">
             <wp:extent cx="5303520" cy="5303520"/>
-            <wp:docPr id="7" name="Picture 7"/>
+            <wp:docPr id="9" name="Picture 9"/>
             <wp:cNvGraphicFramePr>
               <a:graphicFrameLocks noChangeAspect="1"/>
             </wp:cNvGraphicFramePr>
@@ -3218,7 +3900,7 @@
                     <pic:cNvPicPr/>
                   </pic:nvPicPr>
                   <pic:blipFill>
-                    <a:blip r:embed="rId15"/>
+                    <a:blip r:embed="rId17"/>
                     <a:stretch>
                       <a:fillRect/>
                     </a:stretch>

</xml_diff>

<commit_message>
docs: add ROC curve comparison for both Random Forest and XGBoost algorithms
</commit_message>
<xml_diff>
--- a/PROJECT_REPORT.docx
+++ b/PROJECT_REPORT.docx
@@ -3501,24 +3501,74 @@
     </w:p>
     <w:p>
       <w:pPr>
-        <w:spacing w:before="240" w:after="240"/>
-        <w:jc w:val="center"/>
-      </w:pPr>
-      <w:r>
-        <w:rPr>
-          <w:color w:val="D2D6DB"/>
-        </w:rPr>
-        <w:t>__________________________________________________________________</w:t>
-      </w:r>
-    </w:p>
-    <w:p>
-      <w:pPr>
         <w:pStyle w:val="Heading3"/>
         <w:keepNext/>
         <w:spacing w:before="200" w:after="80"/>
       </w:pPr>
       <w:r>
-        <w:t>5.4 ROC Curve &amp; Feature Importance</w:t>
+        <w:t>5.4 Receiver Operating Characteristic (ROC) Curve Comparison for Both Algorithms</w:t>
+      </w:r>
+    </w:p>
+    <w:p>
+      <w:pPr>
+        <w:spacing w:after="120"/>
+      </w:pPr>
+      <w:r>
+        <w:t>The Receiver Operating Characteristic (ROC) curve evaluates the trade-off between Sensitivity (True Positive Rate) and 1-Specificity (False Positive Rate) across all decision thresholds:</w:t>
+      </w:r>
+    </w:p>
+    <w:p>
+      <w:pPr>
+        <w:spacing w:before="240" w:after="80"/>
+        <w:jc w:val="center"/>
+      </w:pPr>
+      <w:r>
+        <w:drawing>
+          <wp:inline xmlns:a="http://schemas.openxmlformats.org/drawingml/2006/main" xmlns:pic="http://schemas.openxmlformats.org/drawingml/2006/picture">
+            <wp:extent cx="5303520" cy="4284218"/>
+            <wp:docPr id="6" name="Picture 6"/>
+            <wp:cNvGraphicFramePr>
+              <a:graphicFrameLocks noChangeAspect="1"/>
+            </wp:cNvGraphicFramePr>
+            <a:graphic>
+              <a:graphicData uri="http://schemas.openxmlformats.org/drawingml/2006/picture">
+                <pic:pic>
+                  <pic:nvPicPr>
+                    <pic:cNvPr id="0" name="roc_curve_comparison.png"/>
+                    <pic:cNvPicPr/>
+                  </pic:nvPicPr>
+                  <pic:blipFill>
+                    <a:blip r:embed="rId14"/>
+                    <a:stretch>
+                      <a:fillRect/>
+                    </a:stretch>
+                  </pic:blipFill>
+                  <pic:spPr>
+                    <a:xfrm>
+                      <a:off x="0" y="0"/>
+                      <a:ext cx="5303520" cy="4284218"/>
+                    </a:xfrm>
+                    <a:prstGeom prst="rect"/>
+                  </pic:spPr>
+                </pic:pic>
+              </a:graphicData>
+            </a:graphic>
+          </wp:inline>
+        </w:drawing>
+      </w:r>
+    </w:p>
+    <w:p>
+      <w:pPr>
+        <w:spacing w:before="40" w:after="240"/>
+        <w:jc w:val="center"/>
+      </w:pPr>
+      <w:r>
+        <w:rPr>
+          <w:i/>
+          <w:color w:val="64748B"/>
+          <w:sz w:val="19"/>
+        </w:rPr>
+        <w:t>Figure: Dual ROC Curve Comparison Plot</w:t>
       </w:r>
     </w:p>
     <w:p>
@@ -3528,18 +3578,268 @@
         <w:spacing w:before="160" w:after="40"/>
       </w:pPr>
       <w:r>
-        <w:t>1. Receiver Operating Characteristic (ROC) Curve (</w:t>
+        <w:t>ROC Curve Analysis &amp; Findings:</w:t>
+      </w:r>
+    </w:p>
+    <w:tbl>
+      <w:tblPr>
+        <w:tblStyle w:val="TableGrid"/>
+        <w:tblW w:type="auto" w:w="0"/>
+        <w:tblLayout w:type="autofit"/>
+        <w:tblLook w:firstColumn="1" w:firstRow="1" w:lastColumn="0" w:lastRow="0" w:noHBand="0" w:noVBand="1" w:val="04A0"/>
+      </w:tblPr>
+      <w:tblGrid>
+        <w:gridCol w:w="3120"/>
+        <w:gridCol w:w="3120"/>
+        <w:gridCol w:w="3120"/>
+      </w:tblGrid>
+      <w:tr>
+        <w:tc>
+          <w:tcPr>
+            <w:tcW w:type="dxa" w:w="3120"/>
+            <w:shd w:fill="1E293B"/>
+          </w:tcPr>
+          <w:p>
+            <w:pPr>
+              <w:spacing w:before="80" w:after="80"/>
+              <w:jc w:val="left"/>
+            </w:pPr>
+            <w:r/>
+            <w:r>
+              <w:rPr>
+                <w:b/>
+                <w:color w:val="FFFFFF"/>
+              </w:rPr>
+              <w:t>Model Algorithm</w:t>
+            </w:r>
+          </w:p>
+        </w:tc>
+        <w:tc>
+          <w:tcPr>
+            <w:tcW w:type="dxa" w:w="3120"/>
+            <w:shd w:fill="1E293B"/>
+          </w:tcPr>
+          <w:p>
+            <w:pPr>
+              <w:spacing w:before="80" w:after="80"/>
+              <w:jc w:val="left"/>
+            </w:pPr>
+            <w:r/>
+            <w:r>
+              <w:rPr>
+                <w:b/>
+                <w:color w:val="FFFFFF"/>
+              </w:rPr>
+              <w:t>Calculated ROC-AUC Score</w:t>
+            </w:r>
+          </w:p>
+        </w:tc>
+        <w:tc>
+          <w:tcPr>
+            <w:tcW w:type="dxa" w:w="3120"/>
+            <w:shd w:fill="1E293B"/>
+          </w:tcPr>
+          <w:p>
+            <w:pPr>
+              <w:spacing w:before="80" w:after="80"/>
+              <w:jc w:val="left"/>
+            </w:pPr>
+            <w:r/>
+            <w:r>
+              <w:rPr>
+                <w:b/>
+                <w:color w:val="FFFFFF"/>
+              </w:rPr>
+              <w:t>Curve Characteristics &amp; Clinical Findings</w:t>
+            </w:r>
+          </w:p>
+        </w:tc>
+      </w:tr>
+      <w:tr>
+        <w:tc>
+          <w:tcPr>
+            <w:tcW w:type="dxa" w:w="3120"/>
+            <w:shd w:fill="F8FAFC"/>
+          </w:tcPr>
+          <w:p>
+            <w:pPr>
+              <w:spacing w:before="80" w:after="80"/>
+            </w:pPr>
+            <w:r/>
+            <w:r>
+              <w:rPr>
+                <w:b/>
+              </w:rPr>
+              <w:t>Random Forest Classifier</w:t>
+            </w:r>
+          </w:p>
+        </w:tc>
+        <w:tc>
+          <w:tcPr>
+            <w:tcW w:type="dxa" w:w="3120"/>
+            <w:shd w:fill="F8FAFC"/>
+          </w:tcPr>
+          <w:p>
+            <w:pPr>
+              <w:spacing w:before="80" w:after="80"/>
+            </w:pPr>
+            <w:r/>
+            <w:r>
+              <w:rPr>
+                <w:b/>
+              </w:rPr>
+              <w:t>0.9740 (97.40%)</w:t>
+            </w:r>
+          </w:p>
+        </w:tc>
+        <w:tc>
+          <w:tcPr>
+            <w:tcW w:type="dxa" w:w="3120"/>
+            <w:shd w:fill="F8FAFC"/>
+          </w:tcPr>
+          <w:p>
+            <w:pPr>
+              <w:spacing w:before="80" w:after="80"/>
+            </w:pPr>
+            <w:r/>
+            <w:r>
+              <w:t>Steep early slope achieving high sensitivity ($90.07\%$), but produces high false positive trade-offs ($FP=1,945$).</w:t>
+            </w:r>
+          </w:p>
+        </w:tc>
+      </w:tr>
+      <w:tr>
+        <w:tc>
+          <w:tcPr>
+            <w:tcW w:type="dxa" w:w="3120"/>
+          </w:tcPr>
+          <w:p>
+            <w:pPr>
+              <w:spacing w:before="80" w:after="80"/>
+            </w:pPr>
+            <w:r/>
+            <w:r>
+              <w:rPr>
+                <w:b/>
+              </w:rPr>
+              <w:t>XGBoost Classifier (Selected Best)</w:t>
+            </w:r>
+          </w:p>
+        </w:tc>
+        <w:tc>
+          <w:tcPr>
+            <w:tcW w:type="dxa" w:w="3120"/>
+          </w:tcPr>
+          <w:p>
+            <w:pPr>
+              <w:spacing w:before="80" w:after="80"/>
+            </w:pPr>
+            <w:r/>
+            <w:r>
+              <w:rPr>
+                <w:b/>
+              </w:rPr>
+              <w:t>0.9732 (97.32%)</w:t>
+            </w:r>
+          </w:p>
+        </w:tc>
+        <w:tc>
+          <w:tcPr>
+            <w:tcW w:type="dxa" w:w="3120"/>
+          </w:tcPr>
+          <w:p>
+            <w:pPr>
+              <w:spacing w:before="80" w:after="80"/>
+            </w:pPr>
+            <w:r/>
+            <w:r>
+              <w:t>Exceptional class separation curve maintaining near-vertical rise at zero false positive rate ($FP=0$).</w:t>
+            </w:r>
+          </w:p>
+        </w:tc>
+      </w:tr>
+      <w:tr>
+        <w:tc>
+          <w:tcPr>
+            <w:tcW w:type="dxa" w:w="3120"/>
+            <w:shd w:fill="F8FAFC"/>
+          </w:tcPr>
+          <w:p>
+            <w:pPr>
+              <w:spacing w:before="80" w:after="80"/>
+            </w:pPr>
+            <w:r/>
+            <w:r>
+              <w:rPr>
+                <w:b/>
+              </w:rPr>
+              <w:t>Chance Baseline</w:t>
+            </w:r>
+          </w:p>
+        </w:tc>
+        <w:tc>
+          <w:tcPr>
+            <w:tcW w:type="dxa" w:w="3120"/>
+            <w:shd w:fill="F8FAFC"/>
+          </w:tcPr>
+          <w:p>
+            <w:pPr>
+              <w:spacing w:before="80" w:after="80"/>
+            </w:pPr>
+            <w:r/>
+            <w:r>
+              <w:rPr>
+                <w:b/>
+              </w:rPr>
+              <w:t>0.5000 (50.00%)</w:t>
+            </w:r>
+          </w:p>
+        </w:tc>
+        <w:tc>
+          <w:tcPr>
+            <w:tcW w:type="dxa" w:w="3120"/>
+            <w:shd w:fill="F8FAFC"/>
+          </w:tcPr>
+          <w:p>
+            <w:pPr>
+              <w:spacing w:before="80" w:after="80"/>
+            </w:pPr>
+            <w:r/>
+            <w:r>
+              <w:t>Random guess diagonal line baseline.</w:t>
+            </w:r>
+          </w:p>
+        </w:tc>
+      </w:tr>
+    </w:tbl>
+    <w:p>
+      <w:pPr>
+        <w:spacing w:after="120"/>
+      </w:pPr>
+    </w:p>
+    <w:p>
+      <w:pPr>
+        <w:pStyle w:val="Heading4"/>
+        <w:keepNext/>
+        <w:spacing w:before="160" w:after="40"/>
+      </w:pPr>
+      <w:r>
+        <w:t>Individual Algorithm ROC Plots:</w:t>
+      </w:r>
+    </w:p>
+    <w:p>
+      <w:pPr>
+        <w:pStyle w:val="ListNumber"/>
+        <w:spacing w:after="60"/>
+      </w:pPr>
+      <w:r>
+        <w:rPr>
+          <w:b/>
+        </w:rPr>
+        <w:t>Random Forest ROC Curve (`images/roc_curve_rf.png`)</w:t>
       </w:r>
       <w:r>
-        <w:rPr>
-          <w:rFonts w:ascii="Consolas" w:hAnsi="Consolas"/>
-          <w:color w:val="C7254E"/>
-          <w:sz w:val="19"/>
-        </w:rPr>
-        <w:t>images/roc_curve.png</w:t>
-      </w:r>
-      <w:r>
-        <w:t>)</w:t>
+        <w:t>:</w:t>
       </w:r>
     </w:p>
     <w:p>
@@ -3551,7 +3851,7 @@
         <w:drawing>
           <wp:inline xmlns:a="http://schemas.openxmlformats.org/drawingml/2006/main" xmlns:pic="http://schemas.openxmlformats.org/drawingml/2006/picture">
             <wp:extent cx="5303520" cy="4545874"/>
-            <wp:docPr id="6" name="Picture 6"/>
+            <wp:docPr id="7" name="Picture 7"/>
             <wp:cNvGraphicFramePr>
               <a:graphicFrameLocks noChangeAspect="1"/>
             </wp:cNvGraphicFramePr>
@@ -3559,11 +3859,11 @@
               <a:graphicData uri="http://schemas.openxmlformats.org/drawingml/2006/picture">
                 <pic:pic>
                   <pic:nvPicPr>
-                    <pic:cNvPr id="0" name="roc_curve.png"/>
+                    <pic:cNvPr id="0" name="roc_curve_rf.png"/>
                     <pic:cNvPicPr/>
                   </pic:nvPicPr>
                   <pic:blipFill>
-                    <a:blip r:embed="rId14"/>
+                    <a:blip r:embed="rId15"/>
                     <a:stretch>
                       <a:fillRect/>
                     </a:stretch>
@@ -3593,17 +3893,98 @@
           <w:color w:val="64748B"/>
           <w:sz w:val="19"/>
         </w:rPr>
-        <w:t>Figure: ROC Curve Plot</w:t>
+        <w:t>Figure: Random Forest ROC Curve</w:t>
       </w:r>
     </w:p>
     <w:p>
       <w:pPr>
-        <w:pStyle w:val="Heading4"/>
-        <w:keepNext/>
-        <w:spacing w:before="160" w:after="40"/>
+        <w:pStyle w:val="ListNumber"/>
+        <w:spacing w:after="60"/>
       </w:pPr>
       <w:r>
-        <w:t>2. Feature Importance Breakdown (</w:t>
+        <w:rPr>
+          <w:b/>
+        </w:rPr>
+        <w:t>XGBoost ROC Curve (`images/roc_curve_xgb.png`)</w:t>
+      </w:r>
+      <w:r>
+        <w:t>:</w:t>
+      </w:r>
+    </w:p>
+    <w:p>
+      <w:pPr>
+        <w:spacing w:before="240" w:after="80"/>
+        <w:jc w:val="center"/>
+      </w:pPr>
+      <w:r>
+        <w:drawing>
+          <wp:inline xmlns:a="http://schemas.openxmlformats.org/drawingml/2006/main" xmlns:pic="http://schemas.openxmlformats.org/drawingml/2006/picture">
+            <wp:extent cx="5303520" cy="4545874"/>
+            <wp:docPr id="8" name="Picture 8"/>
+            <wp:cNvGraphicFramePr>
+              <a:graphicFrameLocks noChangeAspect="1"/>
+            </wp:cNvGraphicFramePr>
+            <a:graphic>
+              <a:graphicData uri="http://schemas.openxmlformats.org/drawingml/2006/picture">
+                <pic:pic>
+                  <pic:nvPicPr>
+                    <pic:cNvPr id="0" name="roc_curve_xgb.png"/>
+                    <pic:cNvPicPr/>
+                  </pic:nvPicPr>
+                  <pic:blipFill>
+                    <a:blip r:embed="rId16"/>
+                    <a:stretch>
+                      <a:fillRect/>
+                    </a:stretch>
+                  </pic:blipFill>
+                  <pic:spPr>
+                    <a:xfrm>
+                      <a:off x="0" y="0"/>
+                      <a:ext cx="5303520" cy="4545874"/>
+                    </a:xfrm>
+                    <a:prstGeom prst="rect"/>
+                  </pic:spPr>
+                </pic:pic>
+              </a:graphicData>
+            </a:graphic>
+          </wp:inline>
+        </w:drawing>
+      </w:r>
+    </w:p>
+    <w:p>
+      <w:pPr>
+        <w:spacing w:before="40" w:after="240"/>
+        <w:jc w:val="center"/>
+      </w:pPr>
+      <w:r>
+        <w:rPr>
+          <w:i/>
+          <w:color w:val="64748B"/>
+          <w:sz w:val="19"/>
+        </w:rPr>
+        <w:t>Figure: XGBoost ROC Curve</w:t>
+      </w:r>
+    </w:p>
+    <w:p>
+      <w:pPr>
+        <w:spacing w:before="240" w:after="240"/>
+        <w:jc w:val="center"/>
+      </w:pPr>
+      <w:r>
+        <w:rPr>
+          <w:color w:val="D2D6DB"/>
+        </w:rPr>
+        <w:t>__________________________________________________________________</w:t>
+      </w:r>
+    </w:p>
+    <w:p>
+      <w:pPr>
+        <w:pStyle w:val="Heading3"/>
+        <w:keepNext/>
+        <w:spacing w:before="200" w:after="80"/>
+      </w:pPr>
+      <w:r>
+        <w:t>5.5 Feature Importance Breakdown (</w:t>
       </w:r>
       <w:r>
         <w:rPr>
@@ -3626,7 +4007,7 @@
         <w:drawing>
           <wp:inline xmlns:a="http://schemas.openxmlformats.org/drawingml/2006/main" xmlns:pic="http://schemas.openxmlformats.org/drawingml/2006/picture">
             <wp:extent cx="5303520" cy="3977640"/>
-            <wp:docPr id="7" name="Picture 7"/>
+            <wp:docPr id="9" name="Picture 9"/>
             <wp:cNvGraphicFramePr>
               <a:graphicFrameLocks noChangeAspect="1"/>
             </wp:cNvGraphicFramePr>
@@ -3638,7 +4019,7 @@
                     <pic:cNvPicPr/>
                   </pic:nvPicPr>
                   <pic:blipFill>
-                    <a:blip r:embed="rId15"/>
+                    <a:blip r:embed="rId17"/>
                     <a:stretch>
                       <a:fillRect/>
                     </a:stretch>
@@ -3753,7 +4134,7 @@
         <w:drawing>
           <wp:inline xmlns:a="http://schemas.openxmlformats.org/drawingml/2006/main" xmlns:pic="http://schemas.openxmlformats.org/drawingml/2006/picture">
             <wp:extent cx="5303520" cy="5303520"/>
-            <wp:docPr id="8" name="Picture 8"/>
+            <wp:docPr id="10" name="Picture 10"/>
             <wp:cNvGraphicFramePr>
               <a:graphicFrameLocks noChangeAspect="1"/>
             </wp:cNvGraphicFramePr>
@@ -3765,7 +4146,7 @@
                     <pic:cNvPicPr/>
                   </pic:nvPicPr>
                   <pic:blipFill>
-                    <a:blip r:embed="rId16"/>
+                    <a:blip r:embed="rId18"/>
                     <a:stretch>
                       <a:fillRect/>
                     </a:stretch>
@@ -3888,7 +4269,7 @@
         <w:drawing>
           <wp:inline xmlns:a="http://schemas.openxmlformats.org/drawingml/2006/main" xmlns:pic="http://schemas.openxmlformats.org/drawingml/2006/picture">
             <wp:extent cx="5303520" cy="5303520"/>
-            <wp:docPr id="9" name="Picture 9"/>
+            <wp:docPr id="11" name="Picture 11"/>
             <wp:cNvGraphicFramePr>
               <a:graphicFrameLocks noChangeAspect="1"/>
             </wp:cNvGraphicFramePr>
@@ -3900,7 +4281,7 @@
                     <pic:cNvPicPr/>
                   </pic:nvPicPr>
                   <pic:blipFill>
-                    <a:blip r:embed="rId17"/>
+                    <a:blip r:embed="rId19"/>
                     <a:stretch>
                       <a:fillRect/>
                     </a:stretch>

</xml_diff>